<commit_message>
TS Kramam Tamil final TS 4.4 and 4.5
</commit_message>
<xml_diff>
--- a/TS-Kramam/TS-4.4/TS 4.4 Tamil Krama Paatam Corrections.docx
+++ b/TS-Kramam/TS-4.4/TS 4.4 Tamil Krama Paatam Corrections.docx
@@ -91,7 +91,7 @@
           <w:szCs w:val="32"/>
           <w:u w:val="single"/>
         </w:rPr>
-        <w:t>xxxxxxxx</w:t>
+        <w:t>30th Sep 2026</w:t>
       </w:r>
     </w:p>
     <w:p>
@@ -1385,7 +1385,7 @@
                 <w:cs/>
                 <w:lang w:bidi="ta-IN"/>
               </w:rPr>
-              <w:t>புருப்</w:t>
+              <w:t>புரு</w:t>
             </w:r>
             <w:r>
               <w:rPr>
@@ -1396,7 +1396,17 @@
                 <w:cs/>
                 <w:lang w:bidi="ta-IN"/>
               </w:rPr>
-              <w:t>ரி</w:t>
+              <w:t>ப்ரி</w:t>
+            </w:r>
+            <w:r>
+              <w:rPr>
+                <w:rFonts w:ascii="BRH Tamil Tab Extra" w:hAnsi="BRH Tamil Tab Extra" w:cs="Latha"/>
+                <w:b/>
+                <w:sz w:val="36"/>
+                <w:szCs w:val="28"/>
+                <w:lang w:bidi="ta-IN"/>
+              </w:rPr>
+              <w:t>…</w:t>
             </w:r>
             <w:r>
               <w:rPr>
@@ -4282,80 +4292,6 @@
           </w:p>
         </w:tc>
       </w:tr>
-      <w:tr>
-        <w:trPr>
-          <w:trHeight w:val="1118"/>
-        </w:trPr>
-        <w:tc>
-          <w:tcPr>
-            <w:tcW w:w="3906" w:type="dxa"/>
-          </w:tcPr>
-          <w:p>
-            <w:pPr>
-              <w:widowControl w:val="0"/>
-              <w:tabs>
-                <w:tab w:val="left" w:pos="993"/>
-              </w:tabs>
-              <w:autoSpaceDE w:val="0"/>
-              <w:autoSpaceDN w:val="0"/>
-              <w:adjustRightInd w:val="0"/>
-              <w:spacing w:before="0" w:line="252" w:lineRule="auto"/>
-              <w:ind w:right="297"/>
-              <w:rPr>
-                <w:rFonts w:cs="Arial"/>
-                <w:b/>
-                <w:sz w:val="28"/>
-                <w:szCs w:val="32"/>
-                <w:lang w:val="it-IT"/>
-              </w:rPr>
-            </w:pPr>
-          </w:p>
-        </w:tc>
-        <w:tc>
-          <w:tcPr>
-            <w:tcW w:w="5103" w:type="dxa"/>
-          </w:tcPr>
-          <w:p>
-            <w:pPr>
-              <w:widowControl w:val="0"/>
-              <w:autoSpaceDE w:val="0"/>
-              <w:autoSpaceDN w:val="0"/>
-              <w:adjustRightInd w:val="0"/>
-              <w:spacing w:before="0" w:line="240" w:lineRule="auto"/>
-              <w:ind w:right="-136"/>
-              <w:rPr>
-                <w:rFonts w:ascii="Latha" w:hAnsi="Latha" w:cs="Latha"/>
-                <w:sz w:val="28"/>
-                <w:szCs w:val="28"/>
-                <w:cs/>
-                <w:lang w:bidi="ta-IN"/>
-              </w:rPr>
-            </w:pPr>
-          </w:p>
-        </w:tc>
-        <w:tc>
-          <w:tcPr>
-            <w:tcW w:w="5386" w:type="dxa"/>
-          </w:tcPr>
-          <w:p>
-            <w:pPr>
-              <w:widowControl w:val="0"/>
-              <w:autoSpaceDE w:val="0"/>
-              <w:autoSpaceDN w:val="0"/>
-              <w:adjustRightInd w:val="0"/>
-              <w:spacing w:line="252" w:lineRule="auto"/>
-              <w:ind w:right="-138"/>
-              <w:rPr>
-                <w:rFonts w:ascii="Latha" w:hAnsi="Latha" w:cs="Latha"/>
-                <w:sz w:val="28"/>
-                <w:szCs w:val="28"/>
-                <w:cs/>
-                <w:lang w:bidi="ta-IN"/>
-              </w:rPr>
-            </w:pPr>
-          </w:p>
-        </w:tc>
-      </w:tr>
     </w:tbl>
     <w:p>
       <w:pPr>
@@ -4369,10 +4305,7 @@
           <w:lang w:val="it-IT"/>
         </w:rPr>
       </w:pPr>
-    </w:p>
-    <w:p>
-      <w:pPr>
-        <w:jc w:val="center"/>
+      <w:r>
         <w:rPr>
           <w:b/>
           <w:bCs/>
@@ -4381,98 +4314,8 @@
           <w:u w:val="single"/>
           <w:lang w:val="it-IT"/>
         </w:rPr>
-      </w:pPr>
-    </w:p>
-    <w:p>
-      <w:pPr>
-        <w:jc w:val="center"/>
-        <w:rPr>
-          <w:b/>
-          <w:bCs/>
-          <w:sz w:val="32"/>
-          <w:szCs w:val="32"/>
-          <w:u w:val="single"/>
-          <w:lang w:val="it-IT"/>
-        </w:rPr>
-      </w:pPr>
-    </w:p>
-    <w:p>
-      <w:pPr>
-        <w:jc w:val="center"/>
-        <w:rPr>
-          <w:b/>
-          <w:bCs/>
-          <w:sz w:val="32"/>
-          <w:szCs w:val="32"/>
-          <w:u w:val="single"/>
-          <w:lang w:val="it-IT"/>
-        </w:rPr>
-      </w:pPr>
-    </w:p>
-    <w:p>
-      <w:pPr>
-        <w:jc w:val="center"/>
-        <w:rPr>
-          <w:b/>
-          <w:bCs/>
-          <w:sz w:val="32"/>
-          <w:szCs w:val="32"/>
-          <w:u w:val="single"/>
-          <w:lang w:val="it-IT"/>
-        </w:rPr>
-      </w:pPr>
-    </w:p>
-    <w:p>
-      <w:pPr>
-        <w:jc w:val="center"/>
-        <w:rPr>
-          <w:b/>
-          <w:bCs/>
-          <w:sz w:val="32"/>
-          <w:szCs w:val="32"/>
-          <w:u w:val="single"/>
-          <w:lang w:val="it-IT"/>
-        </w:rPr>
-      </w:pPr>
-    </w:p>
-    <w:p>
-      <w:pPr>
-        <w:jc w:val="center"/>
-        <w:rPr>
-          <w:b/>
-          <w:bCs/>
-          <w:sz w:val="32"/>
-          <w:szCs w:val="32"/>
-          <w:u w:val="single"/>
-          <w:lang w:val="it-IT"/>
-        </w:rPr>
-      </w:pPr>
-    </w:p>
-    <w:p>
-      <w:pPr>
-        <w:jc w:val="center"/>
-        <w:rPr>
-          <w:b/>
-          <w:bCs/>
-          <w:sz w:val="32"/>
-          <w:szCs w:val="32"/>
-          <w:u w:val="single"/>
-          <w:lang w:val="it-IT"/>
-        </w:rPr>
-      </w:pPr>
-    </w:p>
-    <w:p>
-      <w:pPr>
-        <w:jc w:val="center"/>
-        <w:rPr>
-          <w:b/>
-          <w:bCs/>
-          <w:sz w:val="32"/>
-          <w:szCs w:val="32"/>
-          <w:u w:val="single"/>
-          <w:lang w:val="it-IT"/>
-        </w:rPr>
-      </w:pPr>
+        <w:t>===================</w:t>
+      </w:r>
     </w:p>
     <w:p>
       <w:pPr>
@@ -4601,7 +4444,6 @@
           <w:b/>
           <w:bCs/>
         </w:rPr>
-        <w:lastRenderedPageBreak/>
         <w:t>(ignore those which are already incorporated in your book’s version and date)</w:t>
       </w:r>
     </w:p>
@@ -6547,6 +6389,7 @@
           <w:szCs w:val="32"/>
           <w:u w:val="single"/>
         </w:rPr>
+        <w:lastRenderedPageBreak/>
         <w:t xml:space="preserve">TS </w:t>
       </w:r>
       <w:r>
@@ -7288,7 +7131,6 @@
                 <w:sz w:val="28"/>
                 <w:szCs w:val="32"/>
               </w:rPr>
-              <w:lastRenderedPageBreak/>
               <w:t>T.S.4.4.2.1 – Kramam</w:t>
             </w:r>
           </w:p>
@@ -7703,7 +7545,15 @@
                 <w:b/>
                 <w:bCs/>
               </w:rPr>
-              <w:t>(swara bak</w:t>
+              <w:t xml:space="preserve">(swara </w:t>
+            </w:r>
+            <w:proofErr w:type="spellStart"/>
+            <w:r>
+              <w:rPr>
+                <w:b/>
+                <w:bCs/>
+              </w:rPr>
+              <w:t>bak</w:t>
             </w:r>
             <w:r>
               <w:rPr>
@@ -7719,6 +7569,7 @@
               </w:rPr>
               <w:t>ti</w:t>
             </w:r>
+            <w:proofErr w:type="spellEnd"/>
             <w:r>
               <w:rPr>
                 <w:rFonts w:ascii="BRH Devanagari Extra" w:hAnsi="BRH Devanagari Extra" w:cs="BRH Devanagari Extra"/>
@@ -9068,6 +8919,7 @@
               </w:rPr>
               <w:t>வ்யா</w:t>
             </w:r>
+            <w:proofErr w:type="spellStart"/>
             <w:r>
               <w:rPr>
                 <w:rFonts w:ascii="BRH Devanagari Extra" w:hAnsi="BRH Devanagari Extra" w:cs="BRH Devanagari Extra"/>
@@ -9087,6 +8939,7 @@
               </w:rPr>
               <w:t>è</w:t>
             </w:r>
+            <w:proofErr w:type="spellEnd"/>
             <w:r>
               <w:rPr>
                 <w:rFonts w:ascii="Latha" w:hAnsi="Latha" w:cs="Latha"/>
@@ -9543,6 +9396,7 @@
                 <w:sz w:val="28"/>
                 <w:szCs w:val="32"/>
               </w:rPr>
+              <w:lastRenderedPageBreak/>
               <w:t>T.S.4.4.3.2 – Kramam</w:t>
             </w:r>
           </w:p>
@@ -10826,7 +10680,6 @@
                 <w:sz w:val="28"/>
                 <w:szCs w:val="32"/>
               </w:rPr>
-              <w:lastRenderedPageBreak/>
               <w:t>T.S.4.4.4.2 – Kramam</w:t>
             </w:r>
           </w:p>
@@ -13780,6 +13633,7 @@
                 <w:sz w:val="28"/>
                 <w:szCs w:val="32"/>
               </w:rPr>
+              <w:lastRenderedPageBreak/>
               <w:t>T.S.4.4.4.7 – Kramam</w:t>
             </w:r>
           </w:p>
@@ -14616,7 +14470,6 @@
                 <w:sz w:val="28"/>
                 <w:szCs w:val="32"/>
               </w:rPr>
-              <w:lastRenderedPageBreak/>
               <w:t>T.S.4.4.6.2 – Kramam</w:t>
             </w:r>
           </w:p>
@@ -16570,7 +16423,23 @@
                 <w:b/>
                 <w:bCs/>
               </w:rPr>
-              <w:t>“rvo” )</w:t>
+              <w:t>“</w:t>
+            </w:r>
+            <w:proofErr w:type="spellStart"/>
+            <w:r>
+              <w:rPr>
+                <w:b/>
+                <w:bCs/>
+              </w:rPr>
+              <w:t>rvo</w:t>
+            </w:r>
+            <w:proofErr w:type="spellEnd"/>
+            <w:r>
+              <w:rPr>
+                <w:b/>
+                <w:bCs/>
+              </w:rPr>
+              <w:t>” )</w:t>
             </w:r>
           </w:p>
         </w:tc>
@@ -17277,6 +17146,7 @@
                 <w:sz w:val="28"/>
                 <w:szCs w:val="32"/>
               </w:rPr>
+              <w:lastRenderedPageBreak/>
               <w:t>T.S.4.4.11.1 – Kramam</w:t>
             </w:r>
           </w:p>
@@ -17720,7 +17590,23 @@
                 <w:b/>
                 <w:bCs/>
               </w:rPr>
-              <w:t>(visargam inserted)</w:t>
+              <w:t>(</w:t>
+            </w:r>
+            <w:proofErr w:type="spellStart"/>
+            <w:r>
+              <w:rPr>
+                <w:b/>
+                <w:bCs/>
+              </w:rPr>
+              <w:t>visargam</w:t>
+            </w:r>
+            <w:proofErr w:type="spellEnd"/>
+            <w:r>
+              <w:rPr>
+                <w:b/>
+                <w:bCs/>
+              </w:rPr>
+              <w:t xml:space="preserve"> inserted)</w:t>
             </w:r>
           </w:p>
         </w:tc>
@@ -18482,12 +18368,21 @@
               </w:rPr>
               <w:t xml:space="preserve">the </w:t>
             </w:r>
-            <w:r>
-              <w:rPr>
-                <w:b/>
-                <w:bCs/>
-              </w:rPr>
-              <w:t xml:space="preserve">kramam </w:t>
+            <w:proofErr w:type="spellStart"/>
+            <w:r>
+              <w:rPr>
+                <w:b/>
+                <w:bCs/>
+              </w:rPr>
+              <w:t>kramam</w:t>
+            </w:r>
+            <w:proofErr w:type="spellEnd"/>
+            <w:r>
+              <w:rPr>
+                <w:b/>
+                <w:bCs/>
+              </w:rPr>
+              <w:t xml:space="preserve"> </w:t>
             </w:r>
             <w:r>
               <w:rPr>
@@ -18532,7 +18427,6 @@
                 <w:sz w:val="28"/>
                 <w:szCs w:val="32"/>
               </w:rPr>
-              <w:lastRenderedPageBreak/>
               <w:t>T.S.4.4.11.4 – Kramam</w:t>
             </w:r>
           </w:p>
@@ -20203,6 +20097,7 @@
           <w:szCs w:val="32"/>
           <w:u w:val="single"/>
         </w:rPr>
+        <w:lastRenderedPageBreak/>
         <w:t xml:space="preserve">TS </w:t>
       </w:r>
       <w:r>

</xml_diff>